<commit_message>
Complete conditional health care directive and matching instructions
</commit_message>
<xml_diff>
--- a/docassemble/HealthCareDirective2026/data/templates/health_care_directive_2026.docx
+++ b/docassemble/HealthCareDirective2026/data/templates/health_care_directive_2026.docx
@@ -87,7 +87,7 @@
         </w:rPr>
       </w:pPr>
       <w:r>
-        <w:t>{{ user_name }}</w:t>
+        <w:t>{{ users[0] }}</w:t>
       </w:r>
     </w:p>
     <w:p>
@@ -110,7 +110,6 @@
           <w:sz w:val="24"/>
           <w:szCs w:val="24"/>
         </w:rPr>
-        <w:t>{{ user }}</w:t>
       </w:r>
     </w:p>
     <w:p>
@@ -143,9 +142,7 @@
           <w:szCs w:val="22"/>
         </w:rPr>
       </w:pPr>
-      <w:r>
-        <w:t>{{ user_name }}</w:t>
-      </w:r>
+      <w:r/>
     </w:p>
     <w:p>
       <w:pPr>
@@ -184,7 +181,7 @@
           <w:sz w:val="22"/>
           <w:szCs w:val="22"/>
         </w:rPr>
-        <w:t xml:space="preserve"> {{ user }}</w:t>
+        <w:t xml:space="preserve"> {{ users[0] }}</w:t>
       </w:r>
       <w:r>
         <w:rPr>
@@ -628,6 +625,11 @@
     </w:p>
     <w:p/>
     <w:p>
+      <w:r>
+        <w:t>{%p if directive_choices['agent'] %}</w:t>
+      </w:r>
+    </w:p>
+    <w:p>
       <w:pPr>
         <w:rPr>
           <w:rFonts w:ascii="Calibri" w:hAnsi="Calibri" w:cs="Calibri"/>
@@ -1033,9 +1035,7 @@
           <w:bCs/>
         </w:rPr>
       </w:pPr>
-      <w:r>
-        <w:t>{{ health_care_agent }}</w:t>
-      </w:r>
+      <w:r/>
     </w:p>
     <w:p>
       <w:pPr>
@@ -1199,7 +1199,7 @@
           <w:b/>
           <w:bCs/>
         </w:rPr>
-        <w:t xml:space="preserve">{{ agent }} </w:t>
+        <w:t xml:space="preserve">{{ primary_agent }} </w:t>
       </w:r>
       <w:r>
         <w:t>to make</w:t>
@@ -1305,31 +1305,27 @@
         </w:rPr>
       </w:pPr>
       <w:r>
-        <w:t>Relationship of my health care agent to me:</w:t>
+        <w:t>Relationship of my health care agent to me: {{ primary_agent.relationship }}</w:t>
       </w:r>
       <w:r>
         <w:rPr>
           <w:spacing w:val="24"/>
         </w:rPr>
-        <w:t xml:space="preserve"> </w:t>
       </w:r>
       <w:r>
         <w:rPr>
           <w:u w:val="single"/>
         </w:rPr>
-        <w:t>{{ agent</w:t>
       </w:r>
       <w:r>
         <w:rPr>
           <w:u w:val="single"/>
         </w:rPr>
-        <w:t>[0].</w:t>
       </w:r>
       <w:r>
         <w:rPr>
           <w:u w:val="single"/>
         </w:rPr>
-        <w:t>relationship }}</w:t>
       </w:r>
     </w:p>
     <w:p>
@@ -1350,7 +1346,7 @@
         <w:rPr>
           <w:u w:val="single"/>
         </w:rPr>
-        <w:t>{{ agent[0].phone_number }}</w:t>
+        <w:t>{{ primary_agent.phone_number }}</w:t>
       </w:r>
     </w:p>
     <w:p>
@@ -1400,7 +1396,7 @@
           <w:spacing w:val="-5"/>
           <w:u w:val="single"/>
         </w:rPr>
-        <w:t>{{ agent[0].address.</w:t>
+        <w:t>{{ primary_agent.address.</w:t>
       </w:r>
       <w:r>
         <w:rPr>
@@ -1420,169 +1416,119 @@
     <w:p/>
     <w:p>
       <w:r>
-        <w:t>(Optional)</w:t>
+        <w:t>{%p if appoint_alternate_agent %}</w:t>
+      </w:r>
+    </w:p>
+    <w:p>
+      <w:r>
+        <w:t>(Optional) Appointment of Alternate Health Care Agent: If my health care agent is not reasonably available, I trust and appoint {{ alternate_agent }} to be my health care agent instead.</w:t>
       </w:r>
       <w:r>
         <w:rPr>
           <w:spacing w:val="-13"/>
         </w:rPr>
-        <w:t xml:space="preserve"> </w:t>
-      </w:r>
-      <w:r>
-        <w:t>Appointment</w:t>
-      </w:r>
+      </w:r>
+      <w:r/>
       <w:r>
         <w:rPr>
           <w:spacing w:val="-12"/>
         </w:rPr>
-        <w:t xml:space="preserve"> </w:t>
-      </w:r>
-      <w:r>
-        <w:t>of</w:t>
-      </w:r>
+      </w:r>
+      <w:r/>
       <w:r>
         <w:rPr>
           <w:spacing w:val="-13"/>
         </w:rPr>
-        <w:t xml:space="preserve"> </w:t>
-      </w:r>
-      <w:r>
-        <w:t>Alternate Health Care</w:t>
-      </w:r>
+      </w:r>
+      <w:r/>
       <w:r>
         <w:rPr>
           <w:spacing w:val="-13"/>
         </w:rPr>
-        <w:t xml:space="preserve"> </w:t>
-      </w:r>
-      <w:r>
-        <w:t>Agent:</w:t>
-      </w:r>
+      </w:r>
+      <w:r/>
       <w:r>
         <w:rPr>
           <w:spacing w:val="22"/>
         </w:rPr>
-        <w:t xml:space="preserve"> </w:t>
-      </w:r>
-      <w:r>
-        <w:t>If</w:t>
-      </w:r>
+      </w:r>
+      <w:r/>
       <w:r>
         <w:rPr>
           <w:spacing w:val="-13"/>
         </w:rPr>
-        <w:t xml:space="preserve"> </w:t>
-      </w:r>
-      <w:r>
-        <w:t>my</w:t>
-      </w:r>
+      </w:r>
+      <w:r/>
       <w:r>
         <w:rPr>
           <w:spacing w:val="-12"/>
         </w:rPr>
-        <w:t xml:space="preserve"> </w:t>
-      </w:r>
-      <w:r>
-        <w:t>health care</w:t>
-      </w:r>
+      </w:r>
+      <w:r/>
       <w:r>
         <w:rPr>
           <w:spacing w:val="-13"/>
         </w:rPr>
-        <w:t xml:space="preserve"> </w:t>
-      </w:r>
-      <w:r>
-        <w:t>agent</w:t>
-      </w:r>
+      </w:r>
+      <w:r/>
       <w:r>
         <w:rPr>
           <w:spacing w:val="-10"/>
         </w:rPr>
-        <w:t xml:space="preserve"> </w:t>
-      </w:r>
-      <w:r>
-        <w:t>is</w:t>
-      </w:r>
+      </w:r>
+      <w:r/>
       <w:r>
         <w:rPr>
           <w:spacing w:val="-13"/>
         </w:rPr>
-        <w:t xml:space="preserve"> </w:t>
-      </w:r>
-      <w:r>
-        <w:t>not</w:t>
-      </w:r>
+      </w:r>
+      <w:r/>
       <w:r>
         <w:rPr>
           <w:spacing w:val="-8"/>
         </w:rPr>
-        <w:t xml:space="preserve"> </w:t>
-      </w:r>
-      <w:r>
-        <w:t>reasonably</w:t>
-      </w:r>
+      </w:r>
+      <w:r/>
       <w:r>
         <w:rPr>
           <w:spacing w:val="-4"/>
         </w:rPr>
-        <w:t xml:space="preserve"> </w:t>
-      </w:r>
-      <w:r>
-        <w:t xml:space="preserve">available, I trust and appoint </w:t>
-      </w:r>
-      <w:r>
-        <w:t>{{ agent</w:t>
-      </w:r>
+      </w:r>
+      <w:r/>
+      <w:r/>
       <w:r>
         <w:rPr>
           <w:highlight w:val="yellow"/>
         </w:rPr>
-        <w:t>[1]</w:t>
-      </w:r>
-      <w:r>
-        <w:t xml:space="preserve"> }} </w:t>
-      </w:r>
-      <w:r>
-        <w:t>to be my health care agent instead.</w:t>
-      </w:r>
+      </w:r>
+      <w:r/>
+      <w:r/>
     </w:p>
     <w:p/>
     <w:p>
       <w:r>
-        <w:t>Relationship of alternate health care agent to me:</w:t>
-      </w:r>
-      <w:r>
-        <w:t xml:space="preserve"> {{ agent</w:t>
-      </w:r>
+        <w:t>Relationship of alternate health care agent to me: {{ alternate_agent.relationship }}</w:t>
+      </w:r>
+      <w:r/>
       <w:r>
         <w:rPr>
           <w:highlight w:val="yellow"/>
         </w:rPr>
-        <w:t>[1]</w:t>
-      </w:r>
-      <w:r>
-        <w:t>.relationship }}</w:t>
-      </w:r>
-    </w:p>
-    <w:p>
-      <w:r>
-        <w:t>Telephone number of my alternate health care agent:</w:t>
-      </w:r>
-      <w:r>
-        <w:t>{{ agent</w:t>
-      </w:r>
+      </w:r>
+      <w:r/>
+    </w:p>
+    <w:p>
+      <w:r>
+        <w:t xml:space="preserve">Telephone number of my alternate health care agent:{{ alternate_agent.phone_number }} </w:t>
+      </w:r>
+      <w:r/>
       <w:r>
         <w:rPr>
           <w:highlight w:val="yellow"/>
         </w:rPr>
-        <w:t>[1]</w:t>
-      </w:r>
-      <w:r>
-        <w:t>.phone_number }}</w:t>
-      </w:r>
-      <w:r>
-        <w:t xml:space="preserve"> </w:t>
-      </w:r>
+      </w:r>
+      <w:r/>
+      <w:r/>
     </w:p>
     <w:p>
       <w:pPr>
@@ -1592,65 +1538,45 @@
         </w:rPr>
       </w:pPr>
       <w:r>
-        <w:t>Address</w:t>
+        <w:t>Address of my alternate health care agent: {{ alternate_agent.address.on_one_line() }}</w:t>
       </w:r>
       <w:r>
         <w:rPr>
           <w:spacing w:val="-3"/>
         </w:rPr>
-        <w:t xml:space="preserve"> </w:t>
-      </w:r>
-      <w:r>
-        <w:t>of</w:t>
-      </w:r>
+      </w:r>
+      <w:r/>
       <w:r>
         <w:rPr>
           <w:spacing w:val="-10"/>
         </w:rPr>
-        <w:t xml:space="preserve"> </w:t>
-      </w:r>
-      <w:r>
-        <w:t>my</w:t>
-      </w:r>
+      </w:r>
+      <w:r/>
       <w:r>
         <w:rPr>
           <w:spacing w:val="-12"/>
         </w:rPr>
-        <w:t xml:space="preserve"> </w:t>
-      </w:r>
-      <w:r>
-        <w:t>alternate</w:t>
-      </w:r>
+      </w:r>
+      <w:r/>
       <w:r>
         <w:rPr>
           <w:spacing w:val="-6"/>
         </w:rPr>
-        <w:t xml:space="preserve"> </w:t>
-      </w:r>
-      <w:r>
-        <w:t>health care</w:t>
-      </w:r>
+      </w:r>
+      <w:r/>
       <w:r>
         <w:rPr>
           <w:spacing w:val="-13"/>
         </w:rPr>
-        <w:t xml:space="preserve"> </w:t>
-      </w:r>
-      <w:r>
-        <w:t>agent</w:t>
-      </w:r>
-      <w:r>
-        <w:t>: {{ agent</w:t>
-      </w:r>
+      </w:r>
+      <w:r/>
+      <w:r/>
       <w:r>
         <w:rPr>
           <w:highlight w:val="yellow"/>
         </w:rPr>
-        <w:t>[1]</w:t>
-      </w:r>
-      <w:r>
-        <w:t>.address.on_one_line() }}</w:t>
-      </w:r>
+      </w:r>
+      <w:r/>
       <w:r>
         <w:rPr>
           <w:rStyle w:val="CommentReference"/>
@@ -1685,6 +1611,11 @@
       </w:pPr>
     </w:p>
     <w:p>
+      <w:r>
+        <w:t>{%p endif %}</w:t>
+      </w:r>
+    </w:p>
+    <w:p>
       <w:pPr>
         <w:pStyle w:val="Heading1"/>
         <w:rPr>
@@ -1696,7 +1627,6 @@
       <w:bookmarkEnd w:id="5"/>
       <w:bookmarkEnd w:id="6"/>
       <w:r>
-        <w:lastRenderedPageBreak/>
         <w:t>THIS</w:t>
       </w:r>
       <w:r>
@@ -4358,13 +4288,6 @@
         <w:rPr>
           <w:noProof/>
         </w:rPr>
-        <w:lastRenderedPageBreak/>
-        <w:pict w14:anchorId="2877C423">
-          <v:shape id="_x0000_s1026" style="position:absolute;margin-left:543.15pt;margin-top:.65pt;width:61.35pt;height:.05pt;z-index:251652096;mso-position-horizontal-relative:page;mso-position-vertical-relative:page" coordsize="1227,1" o:allowincell="f" path="m,hhl1227,e" filled="f" strokecolor="#989898" strokeweight=".71pt">
-            <v:path arrowok="t"/>
-            <w10:wrap anchorx="page" anchory="page"/>
-          </v:shape>
-        </w:pict>
       </w:r>
     </w:p>
     <w:p>
@@ -4411,6 +4334,16 @@
       </w:pPr>
     </w:p>
     <w:p>
+      <w:r>
+        <w:t>{%p endif %}</w:t>
+      </w:r>
+    </w:p>
+    <w:p>
+      <w:r>
+        <w:t>{%p if directive_choices['instructions'] %}</w:t>
+      </w:r>
+    </w:p>
+    <w:p>
       <w:pPr>
         <w:rPr>
           <w:rFonts w:ascii="Calibri" w:hAnsi="Calibri" w:cs="Calibri"/>
@@ -4831,6 +4764,11 @@
     </w:p>
     <w:p/>
     <w:p>
+      <w:r>
+        <w:t>{%p if health_care_goals %}</w:t>
+      </w:r>
+    </w:p>
+    <w:p>
       <w:pPr>
         <w:numPr>
           <w:ilvl w:val="0"/>
@@ -4929,16 +4867,20 @@
         <w:rPr>
           <w:noProof/>
         </w:rPr>
-        <w:pict w14:anchorId="0B6C9302">
-          <v:shape id="_x0000_s1028" style="position:absolute;margin-left:120.9pt;margin-top:34.35pt;width:405.15pt;height:.05pt;z-index:251640832;mso-wrap-distance-left:0;mso-wrap-distance-right:0;mso-position-horizontal-relative:page;mso-position-vertical-relative:text" coordsize="8103,1" o:allowincell="f" path="m,hhl8102,e" filled="f" strokeweight=".14053mm">
-            <v:path arrowok="t"/>
-            <w10:wrap type="topAndBottom" anchorx="page"/>
-          </v:shape>
-        </w:pict>
+      </w:r>
+    </w:p>
+    <w:p>
+      <w:r>
+        <w:t>{%p endif %}</w:t>
       </w:r>
     </w:p>
     <w:p/>
     <w:p/>
+    <w:p>
+      <w:r>
+        <w:t>{%p if health_care_fears %}</w:t>
+      </w:r>
+    </w:p>
     <w:p>
       <w:pPr>
         <w:numPr>
@@ -5053,16 +4995,20 @@
         <w:rPr>
           <w:noProof/>
         </w:rPr>
-        <w:pict w14:anchorId="28D39BBD">
-          <v:shape id="_x0000_s1030" style="position:absolute;margin-left:120.9pt;margin-top:34.2pt;width:405.1pt;height:.05pt;z-index:251642880;mso-wrap-distance-left:0;mso-wrap-distance-right:0;mso-position-horizontal-relative:page;mso-position-vertical-relative:text" coordsize="8102,1" o:allowincell="f" path="m,hhl8101,e" filled="f" strokeweight=".14053mm">
-            <v:path arrowok="t"/>
-            <w10:wrap type="topAndBottom" anchorx="page"/>
-          </v:shape>
-        </w:pict>
+      </w:r>
+    </w:p>
+    <w:p>
+      <w:r>
+        <w:t>{%p endif %}</w:t>
       </w:r>
     </w:p>
     <w:p/>
     <w:p/>
+    <w:p>
+      <w:r>
+        <w:t>{%p if spiritual_beliefs %}</w:t>
+      </w:r>
+    </w:p>
     <w:p>
       <w:pPr>
         <w:numPr>
@@ -5192,16 +5138,20 @@
         <w:rPr>
           <w:noProof/>
         </w:rPr>
-        <w:pict w14:anchorId="00BAFFFD">
-          <v:shape id="_x0000_s1032" style="position:absolute;margin-left:120.9pt;margin-top:34.2pt;width:405.1pt;height:.05pt;z-index:251644928;mso-wrap-distance-left:0;mso-wrap-distance-right:0;mso-position-horizontal-relative:page;mso-position-vertical-relative:text" coordsize="8102,1" o:allowincell="f" path="m,hhl8101,e" filled="f" strokeweight=".14053mm">
-            <v:path arrowok="t"/>
-            <w10:wrap type="topAndBottom" anchorx="page"/>
-          </v:shape>
-        </w:pict>
+      </w:r>
+    </w:p>
+    <w:p>
+      <w:r>
+        <w:t>{%p endif %}</w:t>
       </w:r>
     </w:p>
     <w:p/>
     <w:p/>
+    <w:p>
+      <w:r>
+        <w:t>{%p if beliefs_about_quality_of_life %}</w:t>
+      </w:r>
+    </w:p>
     <w:p>
       <w:pPr>
         <w:numPr>
@@ -5391,16 +5341,20 @@
         <w:rPr>
           <w:noProof/>
         </w:rPr>
-        <w:pict w14:anchorId="619CEABD">
-          <v:shape id="_x0000_s1034" style="position:absolute;margin-left:120.85pt;margin-top:34.3pt;width:405.1pt;height:.05pt;z-index:251646976;mso-wrap-distance-left:0;mso-wrap-distance-right:0;mso-position-horizontal-relative:page;mso-position-vertical-relative:text" coordsize="8102,1" o:allowincell="f" path="m,hhl8101,e" filled="f" strokeweight=".14053mm">
-            <v:path arrowok="t"/>
-            <w10:wrap type="topAndBottom" anchorx="page"/>
-          </v:shape>
-        </w:pict>
+      </w:r>
+    </w:p>
+    <w:p>
+      <w:r>
+        <w:t>{%p endif %}</w:t>
       </w:r>
     </w:p>
     <w:p/>
     <w:p/>
+    <w:p>
+      <w:r>
+        <w:t>{%p if thoughts_about_family %}</w:t>
+      </w:r>
+    </w:p>
     <w:p>
       <w:pPr>
         <w:numPr>
@@ -5590,16 +5544,20 @@
         <w:rPr>
           <w:noProof/>
         </w:rPr>
-        <w:pict w14:anchorId="2D8D8CDB">
-          <v:shape id="_x0000_s1036" style="position:absolute;margin-left:120.85pt;margin-top:34.35pt;width:405.1pt;height:.05pt;z-index:251649024;mso-wrap-distance-left:0;mso-wrap-distance-right:0;mso-position-horizontal-relative:page;mso-position-vertical-relative:text" coordsize="8102,1" o:allowincell="f" path="m,hhl8101,e" filled="f" strokeweight=".14053mm">
-            <v:path arrowok="t"/>
-            <w10:wrap type="topAndBottom" anchorx="page"/>
-          </v:shape>
-        </w:pict>
+      </w:r>
+    </w:p>
+    <w:p>
+      <w:r>
+        <w:t>{%p endif %}</w:t>
       </w:r>
     </w:p>
     <w:p/>
     <w:p/>
+    <w:p>
+      <w:r>
+        <w:t>{%p if pregnancy_care_wishes %}</w:t>
+      </w:r>
+    </w:p>
     <w:p>
       <w:pPr>
         <w:numPr>
@@ -5914,12 +5872,11 @@
         <w:rPr>
           <w:noProof/>
         </w:rPr>
-        <w:pict w14:anchorId="77584AF8">
-          <v:shape id="_x0000_s1038" style="position:absolute;margin-left:111.85pt;margin-top:28.6pt;width:415.05pt;height:.05pt;z-index:251651072;mso-wrap-distance-left:0;mso-wrap-distance-right:0;mso-position-horizontal-relative:page;mso-position-vertical-relative:text" coordsize="8301,1" o:allowincell="f" path="m,hhl8300,e" filled="f" strokeweight=".14053mm">
-            <v:path arrowok="t"/>
-            <w10:wrap type="topAndBottom" anchorx="page"/>
-          </v:shape>
-        </w:pict>
+      </w:r>
+    </w:p>
+    <w:p>
+      <w:r>
+        <w:t>{%p endif %}</w:t>
       </w:r>
     </w:p>
     <w:p/>
@@ -5951,7 +5908,6 @@
       <w:bookmarkStart w:id="8" w:name="THIS IS WHAT I WANT AND DO NOT WANT FOR "/>
       <w:bookmarkEnd w:id="8"/>
       <w:r>
-        <w:lastRenderedPageBreak/>
         <w:t>THIS</w:t>
       </w:r>
       <w:r>
@@ -6679,6 +6635,11 @@
           <w:spacing w:val="-2"/>
         </w:rPr>
         <w:t>blank)</w:t>
+      </w:r>
+    </w:p>
+    <w:p>
+      <w:r>
+        <w:t>{%p if temporary_incapacity_wishes %}</w:t>
       </w:r>
     </w:p>
     <w:p>
@@ -6741,12 +6702,11 @@
         <w:rPr>
           <w:noProof/>
         </w:rPr>
-        <w:pict w14:anchorId="07145646">
-          <v:shape id="_x0000_s1040" style="position:absolute;margin-left:134.95pt;margin-top:22.9pt;width:384.1pt;height:.05pt;z-index:251654144;mso-wrap-distance-left:0;mso-wrap-distance-right:0;mso-position-horizontal-relative:page;mso-position-vertical-relative:text" coordsize="7682,1" o:allowincell="f" path="m,hhl7681,e" filled="f" strokeweight=".14053mm">
-            <v:path arrowok="t"/>
-            <w10:wrap type="topAndBottom" anchorx="page"/>
-          </v:shape>
-        </w:pict>
+      </w:r>
+    </w:p>
+    <w:p>
+      <w:r>
+        <w:t>{%p endif %}</w:t>
       </w:r>
     </w:p>
     <w:p>
@@ -6760,6 +6720,11 @@
           <w:szCs w:val="17"/>
         </w:rPr>
       </w:pPr>
+    </w:p>
+    <w:p>
+      <w:r>
+        <w:t>{%p if dying_care_wishes %}</w:t>
+      </w:r>
     </w:p>
     <w:p>
       <w:pPr>
@@ -7068,12 +7033,11 @@
         <w:rPr>
           <w:noProof/>
         </w:rPr>
-        <w:pict w14:anchorId="21A45B46">
-          <v:shape id="_x0000_s1042" style="position:absolute;margin-left:135pt;margin-top:22.7pt;width:384.1pt;height:.05pt;z-index:251656192;mso-wrap-distance-left:0;mso-wrap-distance-right:0;mso-position-horizontal-relative:page;mso-position-vertical-relative:text" coordsize="7682,1" o:allowincell="f" path="m,hhl7681,e" filled="f" strokeweight=".14053mm">
-            <v:path arrowok="t"/>
-            <w10:wrap type="topAndBottom" anchorx="page"/>
-          </v:shape>
-        </w:pict>
+      </w:r>
+    </w:p>
+    <w:p>
+      <w:r>
+        <w:t>{%p endif %}</w:t>
       </w:r>
     </w:p>
     <w:p>
@@ -7087,6 +7051,11 @@
           <w:szCs w:val="17"/>
         </w:rPr>
       </w:pPr>
+    </w:p>
+    <w:p>
+      <w:r>
+        <w:t>{%p if permanent_unconsciousness_wishes %}</w:t>
+      </w:r>
     </w:p>
     <w:p>
       <w:pPr>
@@ -7413,12 +7382,11 @@
         <w:rPr>
           <w:noProof/>
         </w:rPr>
-        <w:pict w14:anchorId="0AB7104B">
-          <v:shape id="_x0000_s1044" style="position:absolute;margin-left:134.25pt;margin-top:22.6pt;width:385.05pt;height:.05pt;z-index:251658240;mso-wrap-distance-left:0;mso-wrap-distance-right:0;mso-position-horizontal-relative:page;mso-position-vertical-relative:text" coordsize="7701,1" o:allowincell="f" path="m,hhl7700,e" filled="f" strokeweight=".14053mm">
-            <v:path arrowok="t"/>
-            <w10:wrap type="topAndBottom" anchorx="page"/>
-          </v:shape>
-        </w:pict>
+      </w:r>
+    </w:p>
+    <w:p>
+      <w:r>
+        <w:t>{%p endif %}</w:t>
       </w:r>
     </w:p>
     <w:p>
@@ -7432,6 +7400,11 @@
           <w:szCs w:val="17"/>
         </w:rPr>
       </w:pPr>
+    </w:p>
+    <w:p>
+      <w:r>
+        <w:t>{%p if dependent_care_wishes %}</w:t>
+      </w:r>
     </w:p>
     <w:p>
       <w:pPr>
@@ -7646,12 +7619,11 @@
         <w:rPr>
           <w:noProof/>
         </w:rPr>
-        <w:pict w14:anchorId="7FD2B8B7">
-          <v:shape id="_x0000_s1046" style="position:absolute;margin-left:135pt;margin-top:22.9pt;width:384.1pt;height:.05pt;z-index:251660288;mso-wrap-distance-left:0;mso-wrap-distance-right:0;mso-position-horizontal-relative:page;mso-position-vertical-relative:text" coordsize="7682,1" o:allowincell="f" path="m,hhl7681,e" filled="f" strokeweight=".14053mm">
-            <v:path arrowok="t"/>
-            <w10:wrap type="topAndBottom" anchorx="page"/>
-          </v:shape>
-        </w:pict>
+      </w:r>
+    </w:p>
+    <w:p>
+      <w:r>
+        <w:t>{%p endif %}</w:t>
       </w:r>
     </w:p>
     <w:p>
@@ -7665,6 +7637,11 @@
           <w:szCs w:val="17"/>
         </w:rPr>
       </w:pPr>
+    </w:p>
+    <w:p>
+      <w:r>
+        <w:t>{%p if pain_relief_wishes %}</w:t>
+      </w:r>
     </w:p>
     <w:p>
       <w:pPr>
@@ -8250,12 +8227,11 @@
         <w:rPr>
           <w:noProof/>
         </w:rPr>
-        <w:pict w14:anchorId="2C2F01AB">
-          <v:shape id="_x0000_s1048" style="position:absolute;margin-left:133.55pt;margin-top:24.5pt;width:385.05pt;height:.05pt;z-index:251662336;mso-wrap-distance-left:0;mso-wrap-distance-right:0;mso-position-horizontal-relative:page;mso-position-vertical-relative:text" coordsize="7701,1" o:allowincell="f" path="m,hhl7700,e" filled="f" strokeweight=".14053mm">
-            <v:path arrowok="t"/>
-            <w10:wrap type="topAndBottom" anchorx="page"/>
-          </v:shape>
-        </w:pict>
+      </w:r>
+    </w:p>
+    <w:p>
+      <w:r>
+        <w:t>{%p endif %}</w:t>
       </w:r>
     </w:p>
     <w:p>
@@ -8479,6 +8455,11 @@
           <w:spacing w:val="-2"/>
         </w:rPr>
         <w:t>possible:</w:t>
+      </w:r>
+    </w:p>
+    <w:p>
+      <w:r>
+        <w:t>{%p if preferred_doctor %}</w:t>
       </w:r>
     </w:p>
     <w:p>
@@ -8638,6 +8619,16 @@
           <w:noProof/>
         </w:rPr>
         <w:t>{{ preferred_doctor }}</w:t>
+      </w:r>
+    </w:p>
+    <w:p>
+      <w:r>
+        <w:t>{%p endif %}</w:t>
+      </w:r>
+    </w:p>
+    <w:p>
+      <w:r>
+        <w:t>{%p if preferred_care_location %}</w:t>
       </w:r>
     </w:p>
     <w:p>
@@ -8838,6 +8829,16 @@
       </w:r>
     </w:p>
     <w:p>
+      <w:r>
+        <w:t>{%p endif %}</w:t>
+      </w:r>
+    </w:p>
+    <w:p>
+      <w:r>
+        <w:t>{%p if preferred_dying_location %}</w:t>
+      </w:r>
+    </w:p>
+    <w:p>
       <w:pPr>
         <w:pStyle w:val="ListParagraph"/>
         <w:numPr>
@@ -9075,12 +9076,11 @@
         <w:rPr>
           <w:noProof/>
         </w:rPr>
-        <w:pict w14:anchorId="64057B8C">
-          <v:shape id="_x0000_s1052" style="position:absolute;margin-left:133.55pt;margin-top:22.7pt;width:385.05pt;height:.05pt;z-index:251666432;mso-wrap-distance-left:0;mso-wrap-distance-right:0;mso-position-horizontal-relative:page;mso-position-vertical-relative:text" coordsize="7701,1" o:allowincell="f" path="m,hhl7700,e" filled="f" strokeweight=".14053mm">
-            <v:path arrowok="t"/>
-            <w10:wrap type="topAndBottom" anchorx="page"/>
-          </v:shape>
-        </w:pict>
+      </w:r>
+    </w:p>
+    <w:p>
+      <w:r>
+        <w:t>{%p endif %}</w:t>
       </w:r>
     </w:p>
     <w:p>
@@ -9094,6 +9094,11 @@
           <w:szCs w:val="17"/>
         </w:rPr>
       </w:pPr>
+    </w:p>
+    <w:p>
+      <w:r>
+        <w:t>{%p if organ_donation_wishes %}</w:t>
+      </w:r>
     </w:p>
     <w:p>
       <w:pPr>
@@ -9303,12 +9308,11 @@
         <w:rPr>
           <w:noProof/>
         </w:rPr>
-        <w:pict w14:anchorId="56005072">
-          <v:shape id="_x0000_s1054" style="position:absolute;margin-left:133.15pt;margin-top:22.7pt;width:385.05pt;height:.05pt;z-index:251668480;mso-wrap-distance-left:0;mso-wrap-distance-right:0;mso-position-horizontal-relative:page;mso-position-vertical-relative:text" coordsize="7701,1" o:allowincell="f" path="m,hhl7700,e" filled="f" strokeweight=".14053mm">
-            <v:path arrowok="t"/>
-            <w10:wrap type="topAndBottom" anchorx="page"/>
-          </v:shape>
-        </w:pict>
+      </w:r>
+    </w:p>
+    <w:p>
+      <w:r>
+        <w:t>{%p endif %}</w:t>
       </w:r>
     </w:p>
     <w:p>
@@ -9322,6 +9326,11 @@
           <w:szCs w:val="17"/>
         </w:rPr>
       </w:pPr>
+    </w:p>
+    <w:p>
+      <w:r>
+        <w:t>{%p if body_disposition_wishes %}</w:t>
+      </w:r>
     </w:p>
     <w:p>
       <w:pPr>
@@ -9561,12 +9570,11 @@
         <w:rPr>
           <w:noProof/>
         </w:rPr>
-        <w:pict w14:anchorId="5B70E7BC">
-          <v:shape id="_x0000_s1056" style="position:absolute;margin-left:133.15pt;margin-top:22.7pt;width:385.05pt;height:.05pt;z-index:251670528;mso-wrap-distance-left:0;mso-wrap-distance-right:0;mso-position-horizontal-relative:page;mso-position-vertical-relative:text" coordsize="7701,1" o:allowincell="f" path="m,hhl7700,e" filled="f" strokeweight=".14053mm">
-            <v:path arrowok="t"/>
-            <w10:wrap type="topAndBottom" anchorx="page"/>
-          </v:shape>
-        </w:pict>
+      </w:r>
+    </w:p>
+    <w:p>
+      <w:r>
+        <w:t>{%p endif %}</w:t>
       </w:r>
     </w:p>
     <w:p>
@@ -9580,6 +9588,11 @@
           <w:szCs w:val="17"/>
         </w:rPr>
       </w:pPr>
+    </w:p>
+    <w:p>
+      <w:r>
+        <w:t>{%p if other_health_care_wishes %}</w:t>
+      </w:r>
     </w:p>
     <w:p>
       <w:pPr>
@@ -9659,6 +9672,11 @@
       </w:r>
     </w:p>
     <w:p>
+      <w:r>
+        <w:t>{%p endif %}</w:t>
+      </w:r>
+    </w:p>
+    <w:p>
       <w:pPr>
         <w:pStyle w:val="BodyText"/>
         <w:kinsoku w:val="0"/>
@@ -9683,6 +9701,11 @@
         <w:overflowPunct w:val="0"/>
         <w:spacing w:before="20"/>
       </w:pPr>
+    </w:p>
+    <w:p>
+      <w:r>
+        <w:t>{%p endif %}</w:t>
+      </w:r>
     </w:p>
     <w:p>
       <w:pPr>
@@ -10304,23 +10327,11 @@
         <w:rPr>
           <w:noProof/>
         </w:rPr>
-        <w:pict w14:anchorId="12C51295">
-          <v:shape id="_x0000_s1058" style="position:absolute;margin-left:145.05pt;margin-top:11.1pt;width:275pt;height:.05pt;z-index:251672576;mso-wrap-distance-left:0;mso-wrap-distance-right:0;mso-position-horizontal-relative:page;mso-position-vertical-relative:text" coordsize="5500,1" o:allowincell="f" path="m,hhl5499,e" filled="f" strokeweight=".14053mm">
-            <v:path arrowok="t"/>
-            <w10:wrap type="topAndBottom" anchorx="page"/>
-          </v:shape>
-        </w:pict>
       </w:r>
       <w:r>
         <w:rPr>
           <w:noProof/>
         </w:rPr>
-        <w:pict w14:anchorId="2D66A22A">
-          <v:shape id="_x0000_s1059" style="position:absolute;margin-left:145.05pt;margin-top:26.95pt;width:275pt;height:.05pt;z-index:251673600;mso-wrap-distance-left:0;mso-wrap-distance-right:0;mso-position-horizontal-relative:page;mso-position-vertical-relative:text" coordsize="5500,1" o:allowincell="f" path="m,hhl5499,e" filled="f" strokeweight=".14053mm">
-            <v:path arrowok="t"/>
-            <w10:wrap type="topAndBottom" anchorx="page"/>
-          </v:shape>
-        </w:pict>
       </w:r>
     </w:p>
     <w:p>
@@ -10392,14 +10403,6 @@
           <w:sz w:val="2"/>
           <w:szCs w:val="2"/>
         </w:rPr>
-        <w:pict w14:anchorId="114AB86A">
-          <v:group id="_x0000_s1060" style="width:175.5pt;height:1pt;mso-position-horizontal-relative:char;mso-position-vertical-relative:line" coordsize="3510,20" o:allowincell="f">
-            <v:shape id="_x0000_s1061" style="position:absolute;top:6;width:3510;height:1;mso-position-horizontal-relative:page;mso-position-vertical-relative:page" coordsize="3510,1" o:allowincell="f" path="m,hhl3509,e" filled="f" strokeweight=".22817mm">
-              <v:path arrowok="t"/>
-            </v:shape>
-            <w10:anchorlock/>
-          </v:group>
-        </w:pict>
       </w:r>
       <w:r>
         <w:rPr>
@@ -10418,14 +10421,6 @@
           <w:sz w:val="2"/>
           <w:szCs w:val="2"/>
         </w:rPr>
-        <w:pict w14:anchorId="376077CA">
-          <v:group id="_x0000_s1062" style="width:205.7pt;height:1pt;mso-position-horizontal-relative:char;mso-position-vertical-relative:line" coordsize="4114,20" o:allowincell="f">
-            <v:shape id="_x0000_s1063" style="position:absolute;top:6;width:4114;height:1;mso-position-horizontal-relative:page;mso-position-vertical-relative:page" coordsize="4114,1" o:allowincell="f" path="m,hhl4113,e" filled="f" strokeweight=".22817mm">
-              <v:path arrowok="t"/>
-            </v:shape>
-            <w10:anchorlock/>
-          </v:group>
-        </w:pict>
       </w:r>
     </w:p>
     <w:p>
@@ -10520,7 +10515,6 @@
           <w:sz w:val="24"/>
           <w:szCs w:val="24"/>
         </w:rPr>
-        <w:br w:type="column"/>
       </w:r>
       <w:r>
         <w:t>Printed name of</w:t>
@@ -10615,31 +10609,6 @@
           <w:sz w:val="12"/>
           <w:szCs w:val="12"/>
         </w:rPr>
-        <w:pict w14:anchorId="0AE057D4">
-          <v:shapetype id="_x0000_t75" coordsize="21600,21600" o:spt="75" o:preferrelative="t" path="m@4@5l@4@11@9@11@9@5xe" filled="f" stroked="f">
-            <v:stroke joinstyle="miter"/>
-            <v:formulas>
-              <v:f eqn="if lineDrawn pixelLineWidth 0"/>
-              <v:f eqn="sum @0 1 0"/>
-              <v:f eqn="sum 0 0 @1"/>
-              <v:f eqn="prod @2 1 2"/>
-              <v:f eqn="prod @3 21600 pixelWidth"/>
-              <v:f eqn="prod @3 21600 pixelHeight"/>
-              <v:f eqn="sum @0 0 1"/>
-              <v:f eqn="prod @6 1 2"/>
-              <v:f eqn="prod @7 21600 pixelWidth"/>
-              <v:f eqn="sum @8 21600 0"/>
-              <v:f eqn="prod @7 21600 pixelHeight"/>
-              <v:f eqn="sum @10 21600 0"/>
-            </v:formulas>
-            <v:path o:extrusionok="f" gradientshapeok="t" o:connecttype="rect"/>
-            <o:lock v:ext="edit" aspectratio="t"/>
-          </v:shapetype>
-          <v:shape id="_x0000_i1027" type="#_x0000_t75" style="width:427.8pt;height:6pt">
-            <v:imagedata r:id="rId8" o:title=""/>
-            <o:lock v:ext="edit" aspectratio="f"/>
-          </v:shape>
-        </w:pict>
       </w:r>
     </w:p>
     <w:p>
@@ -11075,12 +11044,6 @@
         <w:rPr>
           <w:noProof/>
         </w:rPr>
-        <w:pict w14:anchorId="5B961284">
-          <v:shape id="_x0000_s1064" style="position:absolute;margin-left:87.05pt;margin-top:21.75pt;width:175.05pt;height:.05pt;z-index:251674624;mso-wrap-distance-left:0;mso-wrap-distance-right:0;mso-position-horizontal-relative:page;mso-position-vertical-relative:text" coordsize="3501,1" o:allowincell="f" path="m,hhl3500,e" filled="f" strokeweight=".14053mm">
-            <v:path arrowok="t"/>
-            <w10:wrap type="topAndBottom" anchorx="page"/>
-          </v:shape>
-        </w:pict>
       </w:r>
     </w:p>
     <w:p>
@@ -11147,7 +11110,6 @@
       <w:bookmarkStart w:id="11" w:name="Option 2: Two Witnesses"/>
       <w:bookmarkEnd w:id="11"/>
       <w:r>
-        <w:lastRenderedPageBreak/>
         <w:t>Option</w:t>
       </w:r>
       <w:r>
@@ -12444,12 +12406,6 @@
         <w:rPr>
           <w:noProof/>
         </w:rPr>
-        <w:pict w14:anchorId="27513C21">
-          <v:shape id="_x0000_s1065" style="position:absolute;margin-left:303.1pt;margin-top:19.45pt;width:203.1pt;height:.05pt;z-index:251675648;mso-wrap-distance-left:0;mso-wrap-distance-right:0;mso-position-horizontal-relative:page;mso-position-vertical-relative:text" coordsize="4062,1" o:allowincell="f" path="m,hhl4061,e" filled="f" strokeweight=".22817mm">
-            <v:path arrowok="t"/>
-            <w10:wrap type="topAndBottom" anchorx="page"/>
-          </v:shape>
-        </w:pict>
       </w:r>
     </w:p>
     <w:p>
@@ -12550,14 +12506,6 @@
           <w:sz w:val="2"/>
           <w:szCs w:val="2"/>
         </w:rPr>
-        <w:pict w14:anchorId="2D4FFA6D">
-          <v:group id="_x0000_s1066" style="width:379.2pt;height:1pt;mso-position-horizontal-relative:char;mso-position-vertical-relative:line" coordsize="7584,20" o:allowincell="f">
-            <v:shape id="_x0000_s1067" style="position:absolute;top:3;width:7584;height:1;mso-position-horizontal-relative:page;mso-position-vertical-relative:page" coordsize="7584,1" o:allowincell="f" path="m,hhl7583,e" filled="f" strokeweight=".14053mm">
-              <v:path arrowok="t"/>
-            </v:shape>
-            <w10:anchorlock/>
-          </v:group>
-        </w:pict>
       </w:r>
     </w:p>
     <w:p>
@@ -12571,23 +12519,11 @@
         <w:rPr>
           <w:noProof/>
         </w:rPr>
-        <w:pict w14:anchorId="7046FAD7">
-          <v:shape id="_x0000_s1068" style="position:absolute;margin-left:130.05pt;margin-top:14.05pt;width:376.9pt;height:.05pt;z-index:251676672;mso-wrap-distance-left:0;mso-wrap-distance-right:0;mso-position-horizontal-relative:page;mso-position-vertical-relative:text" coordsize="7538,1" o:allowincell="f" path="m,hhl7537,e" filled="f" strokeweight=".14053mm">
-            <v:path arrowok="t"/>
-            <w10:wrap type="topAndBottom" anchorx="page"/>
-          </v:shape>
-        </w:pict>
       </w:r>
       <w:r>
         <w:rPr>
           <w:noProof/>
         </w:rPr>
-        <w:pict w14:anchorId="6E1202BD">
-          <v:shape id="_x0000_s1069" style="position:absolute;margin-left:130.05pt;margin-top:29.25pt;width:376.9pt;height:.05pt;z-index:251677696;mso-wrap-distance-left:0;mso-wrap-distance-right:0;mso-position-horizontal-relative:page;mso-position-vertical-relative:text" coordsize="7538,1" o:allowincell="f" path="m,hhl7537,e" filled="f" strokeweight=".14053mm">
-            <v:path arrowok="t"/>
-            <w10:wrap type="topAndBottom" anchorx="page"/>
-          </v:shape>
-        </w:pict>
       </w:r>
     </w:p>
     <w:p>
@@ -13702,12 +13638,6 @@
         <w:rPr>
           <w:noProof/>
         </w:rPr>
-        <w:pict w14:anchorId="43FFF795">
-          <v:shape id="_x0000_s1070" style="position:absolute;margin-left:303.05pt;margin-top:13.85pt;width:203.15pt;height:.05pt;z-index:251678720;mso-wrap-distance-left:0;mso-wrap-distance-right:0;mso-position-horizontal-relative:page;mso-position-vertical-relative:text" coordsize="4063,1" o:allowincell="f" path="m,hhl4062,e" filled="f" strokeweight=".22817mm">
-            <v:path arrowok="t"/>
-            <w10:wrap type="topAndBottom" anchorx="page"/>
-          </v:shape>
-        </w:pict>
       </w:r>
     </w:p>
     <w:p>
@@ -13808,14 +13738,6 @@
           <w:sz w:val="2"/>
           <w:szCs w:val="2"/>
         </w:rPr>
-        <w:pict w14:anchorId="57263651">
-          <v:group id="_x0000_s1071" style="width:379.25pt;height:1pt;mso-position-horizontal-relative:char;mso-position-vertical-relative:line" coordsize="7585,20" o:allowincell="f">
-            <v:shape id="_x0000_s1072" style="position:absolute;top:3;width:7585;height:1;mso-position-horizontal-relative:page;mso-position-vertical-relative:page" coordsize="7585,1" o:allowincell="f" path="m,hhl7584,e" filled="f" strokeweight=".14053mm">
-              <v:path arrowok="t"/>
-            </v:shape>
-            <w10:anchorlock/>
-          </v:group>
-        </w:pict>
       </w:r>
     </w:p>
     <w:p>
@@ -13829,23 +13751,11 @@
         <w:rPr>
           <w:noProof/>
         </w:rPr>
-        <w:pict w14:anchorId="6FFE9438">
-          <v:shape id="_x0000_s1073" style="position:absolute;margin-left:130.05pt;margin-top:14.05pt;width:376.9pt;height:.05pt;z-index:251679744;mso-wrap-distance-left:0;mso-wrap-distance-right:0;mso-position-horizontal-relative:page;mso-position-vertical-relative:text" coordsize="7538,1" o:allowincell="f" path="m,hhl7537,e" filled="f" strokeweight=".14053mm">
-            <v:path arrowok="t"/>
-            <w10:wrap type="topAndBottom" anchorx="page"/>
-          </v:shape>
-        </w:pict>
       </w:r>
       <w:r>
         <w:rPr>
           <w:noProof/>
         </w:rPr>
-        <w:pict w14:anchorId="14891D89">
-          <v:shape id="_x0000_s1074" style="position:absolute;margin-left:130.05pt;margin-top:29.25pt;width:376.9pt;height:.05pt;z-index:251680768;mso-wrap-distance-left:0;mso-wrap-distance-right:0;mso-position-horizontal-relative:page;mso-position-vertical-relative:text" coordsize="7538,1" o:allowincell="f" path="m,hhl7537,e" filled="f" strokeweight=".14053mm">
-            <v:path arrowok="t"/>
-            <w10:wrap type="topAndBottom" anchorx="page"/>
-          </v:shape>
-        </w:pict>
       </w:r>
     </w:p>
     <w:p>

</xml_diff>